<commit_message>
Added Azure DB ref
</commit_message>
<xml_diff>
--- a/Real Estate Platform Official Report.docx
+++ b/Real Estate Platform Official Report.docx
@@ -277,6 +277,9 @@
       <w:r>
         <w:t xml:space="preserve"> Azure App Service and Azure SQL</w:t>
       </w:r>
+      <w:r>
+        <w:t xml:space="preserve"> DB, Vercel(UI)</w:t>
+      </w:r>
     </w:p>
     <w:p>
       <w:pPr>
@@ -1124,6 +1127,124 @@
       <w:r>
         <w:t>Database behavior remains centralized in Azure SQL</w:t>
       </w:r>
+    </w:p>
+    <w:p>
+      <w:pPr>
+        <w:pStyle w:val="Compact"/>
+      </w:pPr>
+    </w:p>
+    <w:p>
+      <w:pPr>
+        <w:pStyle w:val="Heading3"/>
+      </w:pPr>
+      <w:r>
+        <w:t xml:space="preserve">Azure </w:t>
+      </w:r>
+      <w:r>
+        <w:t xml:space="preserve">Database </w:t>
+      </w:r>
+      <w:r>
+        <w:t>SS</w:t>
+      </w:r>
+    </w:p>
+    <w:p>
+      <w:pPr>
+        <w:pStyle w:val="BodyText"/>
+      </w:pPr>
+      <w:r>
+        <w:drawing>
+          <wp:inline distT="0" distB="0" distL="0" distR="0" wp14:anchorId="5B07B831" wp14:editId="6BB73FE2">
+            <wp:extent cx="5943600" cy="3026410"/>
+            <wp:effectExtent l="0" t="0" r="0" b="0"/>
+            <wp:docPr id="1162846827" name="Picture 1"/>
+            <wp:cNvGraphicFramePr>
+              <a:graphicFrameLocks xmlns:a="http://schemas.openxmlformats.org/drawingml/2006/main" noChangeAspect="1"/>
+            </wp:cNvGraphicFramePr>
+            <a:graphic xmlns:a="http://schemas.openxmlformats.org/drawingml/2006/main">
+              <a:graphicData uri="http://schemas.openxmlformats.org/drawingml/2006/picture">
+                <pic:pic xmlns:pic="http://schemas.openxmlformats.org/drawingml/2006/picture">
+                  <pic:nvPicPr>
+                    <pic:cNvPr id="1162846827" name=""/>
+                    <pic:cNvPicPr/>
+                  </pic:nvPicPr>
+                  <pic:blipFill>
+                    <a:blip r:embed="rId6"/>
+                    <a:stretch>
+                      <a:fillRect/>
+                    </a:stretch>
+                  </pic:blipFill>
+                  <pic:spPr>
+                    <a:xfrm>
+                      <a:off x="0" y="0"/>
+                      <a:ext cx="5943600" cy="3026410"/>
+                    </a:xfrm>
+                    <a:prstGeom prst="rect">
+                      <a:avLst/>
+                    </a:prstGeom>
+                  </pic:spPr>
+                </pic:pic>
+              </a:graphicData>
+            </a:graphic>
+          </wp:inline>
+        </w:drawing>
+      </w:r>
+    </w:p>
+    <w:p>
+      <w:pPr>
+        <w:pStyle w:val="BodyText"/>
+      </w:pPr>
+    </w:p>
+    <w:p>
+      <w:pPr>
+        <w:pStyle w:val="BodyText"/>
+      </w:pPr>
+      <w:r>
+        <w:drawing>
+          <wp:inline distT="0" distB="0" distL="0" distR="0" wp14:anchorId="73A127FB" wp14:editId="50D33E21">
+            <wp:extent cx="5943600" cy="3079115"/>
+            <wp:effectExtent l="0" t="0" r="0" b="0"/>
+            <wp:docPr id="295428091" name="Picture 1"/>
+            <wp:cNvGraphicFramePr>
+              <a:graphicFrameLocks xmlns:a="http://schemas.openxmlformats.org/drawingml/2006/main" noChangeAspect="1"/>
+            </wp:cNvGraphicFramePr>
+            <a:graphic xmlns:a="http://schemas.openxmlformats.org/drawingml/2006/main">
+              <a:graphicData uri="http://schemas.openxmlformats.org/drawingml/2006/picture">
+                <pic:pic xmlns:pic="http://schemas.openxmlformats.org/drawingml/2006/picture">
+                  <pic:nvPicPr>
+                    <pic:cNvPr id="295428091" name=""/>
+                    <pic:cNvPicPr/>
+                  </pic:nvPicPr>
+                  <pic:blipFill>
+                    <a:blip r:embed="rId7"/>
+                    <a:stretch>
+                      <a:fillRect/>
+                    </a:stretch>
+                  </pic:blipFill>
+                  <pic:spPr>
+                    <a:xfrm>
+                      <a:off x="0" y="0"/>
+                      <a:ext cx="5943600" cy="3079115"/>
+                    </a:xfrm>
+                    <a:prstGeom prst="rect">
+                      <a:avLst/>
+                    </a:prstGeom>
+                  </pic:spPr>
+                </pic:pic>
+              </a:graphicData>
+            </a:graphic>
+          </wp:inline>
+        </w:drawing>
+      </w:r>
+    </w:p>
+    <w:p>
+      <w:pPr>
+        <w:pStyle w:val="BodyText"/>
+      </w:pPr>
+    </w:p>
+    <w:p>
+      <w:pPr>
+        <w:pStyle w:val="Compact"/>
+      </w:pPr>
     </w:p>
     <w:p>
       <w:pPr>

</xml_diff>